<commit_message>
feat: add sequence diagrams for Task 5
</commit_message>
<xml_diff>
--- a/Sequence diagrams/Sequence visualizer.docx
+++ b/Sequence diagrams/Sequence visualizer.docx
@@ -9,6 +9,9 @@
     </w:p>
     <w:p>
       <w:r>
+        <w:rPr>
+          <w:noProof/>
+        </w:rPr>
         <w:drawing>
           <wp:inline distT="0" distB="0" distL="0" distR="0" wp14:anchorId="4A615720" wp14:editId="122746C6">
             <wp:extent cx="5486400" cy="7591425"/>
@@ -54,6 +57,9 @@
     </w:p>
     <w:p>
       <w:r>
+        <w:rPr>
+          <w:noProof/>
+        </w:rPr>
         <w:drawing>
           <wp:inline distT="0" distB="0" distL="0" distR="0" wp14:anchorId="6FEFE932" wp14:editId="56ADA7AA">
             <wp:extent cx="5943600" cy="4292600"/>
@@ -97,6 +103,9 @@
         <w:t>Sequence diagram 2</w:t>
       </w:r>
       <w:r>
+        <w:rPr>
+          <w:noProof/>
+        </w:rPr>
         <w:drawing>
           <wp:inline distT="0" distB="0" distL="0" distR="0" wp14:anchorId="5574BA38" wp14:editId="64FBF960">
             <wp:extent cx="5943600" cy="4127500"/>
@@ -144,15 +153,15 @@
       </w:pPr>
       <w:r>
         <w:lastRenderedPageBreak/>
-        <w:t xml:space="preserve">Sequence diagram </w:t>
-      </w:r>
-      <w:r>
-        <w:t>3</w:t>
+        <w:t>Sequence diagram 3</w:t>
       </w:r>
       <w:r>
         <w:tab/>
       </w:r>
       <w:r>
+        <w:rPr>
+          <w:noProof/>
+        </w:rPr>
         <w:drawing>
           <wp:inline distT="0" distB="0" distL="0" distR="0" wp14:anchorId="21384124" wp14:editId="3309AB1C">
             <wp:extent cx="5943600" cy="3797300"/>
@@ -271,6 +280,9 @@
         </w:tabs>
       </w:pPr>
       <w:r>
+        <w:rPr>
+          <w:noProof/>
+        </w:rPr>
         <w:drawing>
           <wp:inline distT="0" distB="0" distL="0" distR="0" wp14:anchorId="564D2B72" wp14:editId="22393F48">
             <wp:extent cx="5943600" cy="6273800"/>
@@ -343,6 +355,9 @@
         <w:br/>
       </w:r>
       <w:r>
+        <w:rPr>
+          <w:noProof/>
+        </w:rPr>
         <w:drawing>
           <wp:inline distT="0" distB="0" distL="0" distR="0" wp14:anchorId="34308D7B" wp14:editId="05C888ED">
             <wp:extent cx="5943600" cy="4953000"/>
@@ -447,6 +462,9 @@
         </w:tabs>
       </w:pPr>
       <w:r>
+        <w:rPr>
+          <w:noProof/>
+        </w:rPr>
         <w:drawing>
           <wp:inline distT="0" distB="0" distL="0" distR="0" wp14:anchorId="4054E50B" wp14:editId="33F138E8">
             <wp:extent cx="5943600" cy="6785610"/>
@@ -1094,6 +1112,7 @@
   <w:style w:type="character" w:default="1" w:styleId="DefaultParagraphFont">
     <w:name w:val="Default Paragraph Font"/>
     <w:uiPriority w:val="1"/>
+    <w:semiHidden/>
     <w:unhideWhenUsed/>
   </w:style>
   <w:style w:type="table" w:default="1" w:styleId="TableNormal">

</xml_diff>